<commit_message>
Update connection diagram, fix WHO figure and add citations
</commit_message>
<xml_diff>
--- a/documentation/technical-document/Documentacao_Tecnica_PT.docx
+++ b/documentation/technical-document/Documentacao_Tecnica_PT.docx
@@ -190,7 +190,7 @@
           <w:i w:val="false"/>
           <w:iCs w:val="false"/>
         </w:rPr>
-        <w:t xml:space="preserve">As quedas são a principal causa de lesões graves e mortes acidentais em idosos, com cerca de 646 mil mortes anuais no mundo (OMS, 2021). Além do impacto em si, o tempo prolongado no chão sem socorro — o chamado “long-lie” — agrava significativamente o quadro clínico, podendo ser fatal mesmo quando a queda não causou lesão direta.</w:t>
+        <w:t xml:space="preserve">As quedas são a principal causa de lesões graves e mortes acidentais em idosos, com cerca de 684 mil mortes anuais no mundo (OMS, 2021). Além do impacto em si, o tempo prolongado no chão sem socorro — o chamado “long-lie” — agrava significativamente o quadro clínico, podendo ser fatal mesmo quando a queda não causou lesão direta.</w:t>
       </w:r>
     </w:p>
     <w:p>
@@ -239,7 +239,7 @@
       <w:r>
         <w:drawing>
           <wp:inline distT="0" distB="0" distL="0" distR="0">
-            <wp:extent cx="5715000" cy="3162300"/>
+            <wp:extent cx="5715000" cy="3214688"/>
             <wp:effectExtent t="0" r="0" b="0" l="0"/>
             <wp:docPr id="1" name="" descr="" title=""/>
             <wp:cNvGraphicFramePr>
@@ -264,7 +264,7 @@
                   <pic:spPr bwMode="auto">
                     <a:xfrm>
                       <a:off x="0" y="0"/>
-                      <a:ext cx="5715000" cy="3162300"/>
+                      <a:ext cx="5715000" cy="3214688"/>
                     </a:xfrm>
                     <a:prstGeom prst="rect">
                       <a:avLst/>
@@ -2257,7 +2257,7 @@
           <w:i w:val="false"/>
           <w:iCs w:val="false"/>
         </w:rPr>
-        <w:t xml:space="preserve">O servidor é um Raspberry Pi 3B+ executando o Home Assistant OS com o broker MQTT Mosquitto. O ESP32 publica nos tópicos abaixo; automações no Home Assistant reagem e enviam uma notificação persistente ao celular do cuidador (que não desaparece até ser confirmada).</w:t>
+        <w:t xml:space="preserve">O servidor é um Raspberry Pi 3B+ executando o Home Assistant OS (Nabu Casa, 2023) com o broker MQTT Mosquitto, que implementa o protocolo de publicação/assinatura MQTT (Banks &amp; Gupta, 2014). O ESP32 (Espressif, 2023) publica nos tópicos abaixo; automações no Home Assistant reagem e enviam uma notificação persistente ao celular do cuidador (que não desaparece até ser confirmada).</w:t>
       </w:r>
     </w:p>
     <w:tbl>

</xml_diff>